<commit_message>
Translate skill docs, templates and example to English
Template labels are now English and rendered in the document language
(Thai by default); README rewritten in English with install steps.

Co-Authored-By: Claude Opus 5.5 <noreply@anthropic.com>
Claude-Session: https://claude.ai/code/session_01QiLF94QhvD1XTnDF8RiZLC
</commit_message>
<xml_diff>
--- a/docs/examples/TC_SALES_v18_20261013.docx
+++ b/docs/examples/TC_SALES_v18_20261013.docx
@@ -163,7 +163,7 @@
         <w:t xml:space="preserve"> </w:t>
       </w:r>
       <w:r>
-        <w:t xml:space="preserve">มีสิทธิ์</w:t>
+        <w:t xml:space="preserve">has group</w:t>
       </w:r>
       <w:r>
         <w:t xml:space="preserve"> </w:t>
@@ -392,7 +392,7 @@
               <w:jc w:val="left"/>
             </w:pPr>
             <w:r>
-              <w:t xml:space="preserve">สร้างใบเสนอราคาและยืนยัน</w:t>
+              <w:t xml:space="preserve">Create and confirm quotation</w:t>
             </w:r>
           </w:p>
         </w:tc>
@@ -444,7 +444,7 @@
               <w:br/>
             </w:r>
             <w:r>
-              <w:t xml:space="preserve">2. เลือก Customer, เพิ่ม Product</w:t>
+              <w:t xml:space="preserve">2. Select Customer, add Product</w:t>
             </w:r>
             <w:r>
               <w:br/>
@@ -484,7 +484,7 @@
               <w:jc w:val="left"/>
             </w:pPr>
             <w:r>
-              <w:t xml:space="preserve">State = Sales Order; Delivery 1 ใบ; Untaxed 2,000 / Tax 140 / Total 2,140</w:t>
+              <w:t xml:space="preserve">State = Sales Order; 1 Delivery created; Untaxed 2,000 / Tax 140 / Total 2,140</w:t>
             </w:r>
           </w:p>
         </w:tc>
@@ -542,7 +542,7 @@
               <w:jc w:val="left"/>
             </w:pPr>
             <w:r>
-              <w:t xml:space="preserve">ไม่ระบุลูกค้า</w:t>
+              <w:t xml:space="preserve">Save without customer</w:t>
             </w:r>
           </w:p>
         </w:tc>
@@ -594,7 +594,7 @@
               <w:br/>
             </w:r>
             <w:r>
-              <w:t xml:space="preserve">2. ไม่เลือก Customer กด</w:t>
+              <w:t xml:space="preserve">2. Leave Customer empty, click</w:t>
             </w:r>
             <w:r>
               <w:t xml:space="preserve"> </w:t>
@@ -628,7 +628,7 @@
               <w:jc w:val="left"/>
             </w:pPr>
             <w:r>
-              <w:t xml:space="preserve">แสดง error ฟิลด์ Customer บังคับ, บันทึกไม่ได้</w:t>
+              <w:t xml:space="preserve">Error: Customer is required; record not saved</w:t>
             </w:r>
           </w:p>
         </w:tc>
@@ -686,7 +686,7 @@
               <w:jc w:val="left"/>
             </w:pPr>
             <w:r>
-              <w:t xml:space="preserve">ออก Invoice ก่อนส่งของ</w:t>
+              <w:t xml:space="preserve">Invoice before delivery</w:t>
             </w:r>
           </w:p>
         </w:tc>
@@ -722,7 +722,7 @@
               <w:jc w:val="left"/>
             </w:pPr>
             <w:r>
-              <w:t xml:space="preserve">1. เปิด SO</w:t>
+              <w:t xml:space="preserve">1. Open SO</w:t>
             </w:r>
             <w:r>
               <w:br/>
@@ -762,7 +762,7 @@
               <w:jc w:val="left"/>
             </w:pPr>
             <w:r>
-              <w:t xml:space="preserve">แจ้งไม่มีรายการให้ออก Invoice (Delivered = 0)</w:t>
+              <w:t xml:space="preserve">Message: nothing to invoice (Delivered = 0)</w:t>
             </w:r>
           </w:p>
         </w:tc>
@@ -824,7 +824,7 @@
               <w:jc w:val="left"/>
             </w:pPr>
             <w:r>
-              <w:t xml:space="preserve">ส่งของบางส่วน + Backorder</w:t>
+              <w:t xml:space="preserve">Partial delivery + backorder</w:t>
             </w:r>
           </w:p>
         </w:tc>
@@ -916,7 +916,7 @@
               <w:jc w:val="left"/>
             </w:pPr>
             <w:r>
-              <w:t xml:space="preserve">DO Done 1, Backorder 1 ชิ้น, On Hand 9</w:t>
+              <w:t xml:space="preserve">DO Done 1, Backorder 1 unit, On Hand 9</w:t>
             </w:r>
           </w:p>
         </w:tc>
@@ -974,7 +974,7 @@
               <w:jc w:val="left"/>
             </w:pPr>
             <w:r>
-              <w:t xml:space="preserve">ออก Invoice ตามที่ส่ง</w:t>
+              <w:t xml:space="preserve">Invoice delivered quantity</w:t>
             </w:r>
           </w:p>
         </w:tc>
@@ -1124,7 +1124,7 @@
               <w:jc w:val="left"/>
             </w:pPr>
             <w:r>
-              <w:t xml:space="preserve">จำนวน 0</w:t>
+              <w:t xml:space="preserve">Zero quantity</w:t>
             </w:r>
           </w:p>
         </w:tc>
@@ -1173,10 +1173,7 @@
               <w:t xml:space="preserve">New</w:t>
             </w:r>
             <w:r>
-              <w:t xml:space="preserve"> </w:t>
-            </w:r>
-            <w:r>
-              <w:t xml:space="preserve">เพิ่ม P001 qty 0</w:t>
+              <w:t xml:space="preserve">, add P001 qty 0</w:t>
             </w:r>
             <w:r>
               <w:br/>
@@ -1216,7 +1213,7 @@
               <w:jc w:val="left"/>
             </w:pPr>
             <w:r>
-              <w:t xml:space="preserve">ไม่สร้าง Delivery / ไม่มียอด (verify behaviour ที่ลูกค้าต้องการ)</w:t>
+              <w:t xml:space="preserve">No Delivery created, amount 0 (verify behavior the customer expects)</w:t>
             </w:r>
           </w:p>
         </w:tc>

</xml_diff>